<commit_message>
Custom mapping toggle, Super Admin integration details, pagination fixes
- Super Admin can switch custom field mapping on/off per endpoint (PATCH /integrations/:id/endpoints/:endpointId/field-mapping-access, integration_detail.field_mapping_enabled, default off)
</commit_message>
<xml_diff>
--- a/Mobile app API's.docx
+++ b/Mobile app API's.docx
@@ -12,90 +12,7 @@
         <w:rPr>
           <w:lang w:val="en-PK"/>
         </w:rPr>
-        <w:t xml:space="preserve">Mobile app ko connect </w:t>
-      </w:r>
-      <w:proofErr w:type="spellStart"/>
-      <w:r>
-        <w:rPr>
-          <w:lang w:val="en-PK"/>
-        </w:rPr>
-        <w:t>karne</w:t>
-      </w:r>
-      <w:proofErr w:type="spellEnd"/>
-      <w:r>
-        <w:rPr>
-          <w:lang w:val="en-PK"/>
-        </w:rPr>
-        <w:t xml:space="preserve"> </w:t>
-      </w:r>
-      <w:proofErr w:type="spellStart"/>
-      <w:r>
-        <w:rPr>
-          <w:lang w:val="en-PK"/>
-        </w:rPr>
-        <w:t>ke</w:t>
-      </w:r>
-      <w:proofErr w:type="spellEnd"/>
-      <w:r>
-        <w:rPr>
-          <w:lang w:val="en-PK"/>
-        </w:rPr>
-        <w:t xml:space="preserve"> </w:t>
-      </w:r>
-      <w:proofErr w:type="spellStart"/>
-      <w:r>
-        <w:rPr>
-          <w:lang w:val="en-PK"/>
-        </w:rPr>
-        <w:t>liye</w:t>
-      </w:r>
-      <w:proofErr w:type="spellEnd"/>
-      <w:r>
-        <w:rPr>
-          <w:lang w:val="en-PK"/>
-        </w:rPr>
-        <w:t xml:space="preserve"> ye APIs </w:t>
-      </w:r>
-      <w:proofErr w:type="spellStart"/>
-      <w:r>
-        <w:rPr>
-          <w:lang w:val="en-PK"/>
-        </w:rPr>
-        <w:t>hain</w:t>
-      </w:r>
-      <w:proofErr w:type="spellEnd"/>
-      <w:r>
-        <w:rPr>
-          <w:lang w:val="en-PK"/>
-        </w:rPr>
-        <w:t xml:space="preserve">. Base </w:t>
-      </w:r>
-      <w:r>
-        <w:rPr>
-          <w:highlight w:val="yellow"/>
-          <w:lang w:val="en-PK"/>
-        </w:rPr>
-        <w:t>URL https://tameotam-y5a6.vercel.app/api</w:t>
-      </w:r>
-      <w:r>
-        <w:rPr>
-          <w:lang w:val="en-PK"/>
-        </w:rPr>
-        <w:t xml:space="preserve"> </w:t>
-      </w:r>
-      <w:proofErr w:type="spellStart"/>
-      <w:r>
-        <w:rPr>
-          <w:lang w:val="en-PK"/>
-        </w:rPr>
-        <w:t>hai</w:t>
-      </w:r>
-      <w:proofErr w:type="spellEnd"/>
-      <w:r>
-        <w:rPr>
-          <w:lang w:val="en-PK"/>
-        </w:rPr>
-        <w:t>, local par http://localhost:3000/api.</w:t>
+        <w:t>Base URL: https://attend-hub-v6i2.vercel.app/api</w:t>
       </w:r>
     </w:p>
     <w:p>
@@ -110,7 +27,7 @@
           <w:bCs/>
           <w:lang w:val="en-PK"/>
         </w:rPr>
-        <w:t>Auth (mobile login)</w:t>
+        <w:t>Login (bina token)</w:t>
       </w:r>
     </w:p>
     <w:p>
@@ -127,125 +44,7 @@
         <w:rPr>
           <w:lang w:val="en-PK"/>
         </w:rPr>
-        <w:t xml:space="preserve">POST /auth/mobile/login: company </w:t>
-      </w:r>
-      <w:proofErr w:type="spellStart"/>
-      <w:r>
-        <w:rPr>
-          <w:lang w:val="en-PK"/>
-        </w:rPr>
-        <w:t>shortname</w:t>
-      </w:r>
-      <w:proofErr w:type="spellEnd"/>
-      <w:r>
-        <w:rPr>
-          <w:lang w:val="en-PK"/>
-        </w:rPr>
-        <w:t xml:space="preserve">, employee ID aur password se login. Token </w:t>
-      </w:r>
-      <w:proofErr w:type="spellStart"/>
-      <w:r>
-        <w:rPr>
-          <w:lang w:val="en-PK"/>
-        </w:rPr>
-        <w:t>milta</w:t>
-      </w:r>
-      <w:proofErr w:type="spellEnd"/>
-      <w:r>
-        <w:rPr>
-          <w:lang w:val="en-PK"/>
-        </w:rPr>
-        <w:t xml:space="preserve"> </w:t>
-      </w:r>
-      <w:proofErr w:type="spellStart"/>
-      <w:r>
-        <w:rPr>
-          <w:lang w:val="en-PK"/>
-        </w:rPr>
-        <w:t>hai</w:t>
-      </w:r>
-      <w:proofErr w:type="spellEnd"/>
-      <w:r>
-        <w:rPr>
-          <w:lang w:val="en-PK"/>
-        </w:rPr>
-        <w:t xml:space="preserve">, aur </w:t>
-      </w:r>
-      <w:proofErr w:type="spellStart"/>
-      <w:r>
-        <w:rPr>
-          <w:lang w:val="en-PK"/>
-        </w:rPr>
-        <w:t>yahin</w:t>
-      </w:r>
-      <w:proofErr w:type="spellEnd"/>
-      <w:r>
-        <w:rPr>
-          <w:lang w:val="en-PK"/>
-        </w:rPr>
-        <w:t xml:space="preserve"> employee ek seat </w:t>
-      </w:r>
-      <w:proofErr w:type="spellStart"/>
-      <w:r>
-        <w:rPr>
-          <w:lang w:val="en-PK"/>
-        </w:rPr>
-        <w:t>leta</w:t>
-      </w:r>
-      <w:proofErr w:type="spellEnd"/>
-      <w:r>
-        <w:rPr>
-          <w:lang w:val="en-PK"/>
-        </w:rPr>
-        <w:t xml:space="preserve"> </w:t>
-      </w:r>
-      <w:proofErr w:type="spellStart"/>
-      <w:r>
-        <w:rPr>
-          <w:lang w:val="en-PK"/>
-        </w:rPr>
-        <w:t>hai</w:t>
-      </w:r>
-      <w:proofErr w:type="spellEnd"/>
-      <w:r>
-        <w:rPr>
-          <w:lang w:val="en-PK"/>
-        </w:rPr>
-        <w:t>.</w:t>
-      </w:r>
-    </w:p>
-    <w:p>
-      <w:pPr>
-        <w:numPr>
-          <w:ilvl w:val="0"/>
-          <w:numId w:val="1"/>
-        </w:numPr>
-        <w:rPr>
-          <w:lang w:val="en-PK"/>
-        </w:rPr>
-      </w:pPr>
-      <w:r>
-        <w:rPr>
-          <w:lang w:val="en-PK"/>
-        </w:rPr>
-        <w:t>POST /auth/mobile/refresh: token refresh.</w:t>
-      </w:r>
-    </w:p>
-    <w:p>
-      <w:pPr>
-        <w:numPr>
-          <w:ilvl w:val="0"/>
-          <w:numId w:val="1"/>
-        </w:numPr>
-        <w:rPr>
-          <w:lang w:val="en-PK"/>
-        </w:rPr>
-      </w:pPr>
-      <w:r>
-        <w:rPr>
-          <w:lang w:val="en-PK"/>
-        </w:rPr>
-        <w:t>POST /auth/mobile/logout: logout.</w:t>
+        <w:t>POST https://attend-hub-v6i2.vercel.app/api/auth/mobile/login</w:t>
       </w:r>
     </w:p>
     <w:p>
@@ -260,7 +59,13 @@
           <w:bCs/>
           <w:lang w:val="en-PK"/>
         </w:rPr>
-        <w:t>Attendance</w:t>
+        <w:t>Token ke saath</w:t>
+      </w:r>
+      <w:r>
+        <w:rPr>
+          <w:lang w:val="en-PK"/>
+        </w:rPr>
+        <w:t xml:space="preserve"> (header: Authorization: Bearer &lt;token&gt;)</w:t>
       </w:r>
     </w:p>
     <w:p>
@@ -277,7 +82,7 @@
         <w:rPr>
           <w:lang w:val="en-PK"/>
         </w:rPr>
-        <w:t>POST /attendance/punch: check-in / check-out.</w:t>
+        <w:t>POST https://attend-hub-v6i2.vercel.app/api/auth/mobile/refresh</w:t>
       </w:r>
     </w:p>
     <w:p>
@@ -294,7 +99,7 @@
         <w:rPr>
           <w:lang w:val="en-PK"/>
         </w:rPr>
-        <w:t>GET /hr/attendance-punches: employee ki punches ki history.</w:t>
+        <w:t>POST https://attend-hub-v6i2.vercel.app/api/auth/mobile/logout</w:t>
       </w:r>
     </w:p>
     <w:p>
@@ -311,43 +116,14 @@
         <w:rPr>
           <w:lang w:val="en-PK"/>
         </w:rPr>
-        <w:t>POST /hr/</w:t>
-      </w:r>
-      <w:proofErr w:type="spellStart"/>
-      <w:r>
-        <w:rPr>
-          <w:lang w:val="en-PK"/>
-        </w:rPr>
-        <w:t>qr</w:t>
-      </w:r>
-      <w:proofErr w:type="spellEnd"/>
-      <w:r>
-        <w:rPr>
-          <w:lang w:val="en-PK"/>
-        </w:rPr>
-        <w:t>-attendance/generate: QR attendance.</w:t>
-      </w:r>
-    </w:p>
-    <w:p>
-      <w:pPr>
-        <w:rPr>
-          <w:lang w:val="en-PK"/>
-        </w:rPr>
-      </w:pPr>
-      <w:r>
-        <w:rPr>
-          <w:b/>
-          <w:bCs/>
-          <w:lang w:val="en-PK"/>
-        </w:rPr>
-        <w:t>Employee ka data</w:t>
+        <w:t>POST https://attend-hub-v6i2.vercel.app/api/attendance/punch</w:t>
       </w:r>
     </w:p>
     <w:p>
       <w:pPr>
         <w:numPr>
           <w:ilvl w:val="0"/>
-          <w:numId w:val="3"/>
+          <w:numId w:val="2"/>
         </w:numPr>
         <w:rPr>
           <w:lang w:val="en-PK"/>
@@ -357,14 +133,14 @@
         <w:rPr>
           <w:lang w:val="en-PK"/>
         </w:rPr>
-        <w:t>GET /hr/company-info: company ki info.</w:t>
+        <w:t>GET https://attend-hub-v6i2.vercel.app/api/attendance/me</w:t>
       </w:r>
     </w:p>
     <w:p>
       <w:pPr>
         <w:numPr>
           <w:ilvl w:val="0"/>
-          <w:numId w:val="3"/>
+          <w:numId w:val="2"/>
         </w:numPr>
         <w:rPr>
           <w:lang w:val="en-PK"/>
@@ -374,14 +150,14 @@
         <w:rPr>
           <w:lang w:val="en-PK"/>
         </w:rPr>
-        <w:t>GET /hr/shift: shift.</w:t>
+        <w:t>GET https://attend-hub-v6i2.vercel.app/api/hr/attendance-punches</w:t>
       </w:r>
     </w:p>
     <w:p>
       <w:pPr>
         <w:numPr>
           <w:ilvl w:val="0"/>
-          <w:numId w:val="3"/>
+          <w:numId w:val="2"/>
         </w:numPr>
         <w:rPr>
           <w:lang w:val="en-PK"/>
@@ -391,42 +167,14 @@
         <w:rPr>
           <w:lang w:val="en-PK"/>
         </w:rPr>
-        <w:t xml:space="preserve">GET /hr/leave aur POST /hr/leave: leave </w:t>
-      </w:r>
-      <w:proofErr w:type="spellStart"/>
-      <w:r>
-        <w:rPr>
-          <w:lang w:val="en-PK"/>
-        </w:rPr>
-        <w:t>dekhna</w:t>
-      </w:r>
-      <w:proofErr w:type="spellEnd"/>
-      <w:r>
-        <w:rPr>
-          <w:lang w:val="en-PK"/>
-        </w:rPr>
-        <w:t xml:space="preserve"> aur apply </w:t>
-      </w:r>
-      <w:proofErr w:type="spellStart"/>
-      <w:r>
-        <w:rPr>
-          <w:lang w:val="en-PK"/>
-        </w:rPr>
-        <w:t>karna</w:t>
-      </w:r>
-      <w:proofErr w:type="spellEnd"/>
-      <w:r>
-        <w:rPr>
-          <w:lang w:val="en-PK"/>
-        </w:rPr>
-        <w:t>.</w:t>
+        <w:t>POST https://attend-hub-v6i2.vercel.app/api/hr/qr-attendance/generate</w:t>
       </w:r>
     </w:p>
     <w:p>
       <w:pPr>
         <w:numPr>
           <w:ilvl w:val="0"/>
-          <w:numId w:val="3"/>
+          <w:numId w:val="2"/>
         </w:numPr>
         <w:rPr>
           <w:lang w:val="en-PK"/>
@@ -436,14 +184,14 @@
         <w:rPr>
           <w:lang w:val="en-PK"/>
         </w:rPr>
-        <w:t>GET /hr/holidays: holidays.</w:t>
+        <w:t>GET https://attend-hub-v6i2.vercel.app/api/hr/company-info</w:t>
       </w:r>
     </w:p>
     <w:p>
       <w:pPr>
         <w:numPr>
           <w:ilvl w:val="0"/>
-          <w:numId w:val="3"/>
+          <w:numId w:val="2"/>
         </w:numPr>
         <w:rPr>
           <w:lang w:val="en-PK"/>
@@ -453,29 +201,14 @@
         <w:rPr>
           <w:lang w:val="en-PK"/>
         </w:rPr>
-        <w:t>GET /hr/announcements: announcements.</w:t>
-      </w:r>
-    </w:p>
-    <w:p>
-      <w:pPr>
-        <w:rPr>
-          <w:lang w:val="en-PK"/>
-        </w:rPr>
-      </w:pPr>
-      <w:r>
-        <w:rPr>
-          <w:b/>
-          <w:bCs/>
-          <w:lang w:val="en-PK"/>
-        </w:rPr>
-        <w:t>Device / session</w:t>
+        <w:t>GET https://attend-hub-v6i2.vercel.app/api/hr/shift</w:t>
       </w:r>
     </w:p>
     <w:p>
       <w:pPr>
         <w:numPr>
           <w:ilvl w:val="0"/>
-          <w:numId w:val="4"/>
+          <w:numId w:val="2"/>
         </w:numPr>
         <w:rPr>
           <w:lang w:val="en-PK"/>
@@ -485,22 +218,14 @@
         <w:rPr>
           <w:lang w:val="en-PK"/>
         </w:rPr>
-        <w:t>POST /hr/</w:t>
-      </w:r>
-      <w:proofErr w:type="spellStart"/>
-      <w:r>
-        <w:rPr>
-          <w:lang w:val="en-PK"/>
-        </w:rPr>
-        <w:t>wifi</w:t>
-      </w:r>
-      <w:proofErr w:type="spellEnd"/>
+        <w:t>GET https://attend-hub-v6i2.vercel.app/api/hr/leave</w:t>
+      </w:r>
     </w:p>
     <w:p>
       <w:pPr>
         <w:numPr>
           <w:ilvl w:val="0"/>
-          <w:numId w:val="4"/>
+          <w:numId w:val="2"/>
         </w:numPr>
         <w:rPr>
           <w:lang w:val="en-PK"/>
@@ -510,14 +235,14 @@
         <w:rPr>
           <w:lang w:val="en-PK"/>
         </w:rPr>
-        <w:t>POST /hr/device-info</w:t>
+        <w:t>POST https://attend-hub-v6i2.vercel.app/api/hr/leave</w:t>
       </w:r>
     </w:p>
     <w:p>
       <w:pPr>
         <w:numPr>
           <w:ilvl w:val="0"/>
-          <w:numId w:val="4"/>
+          <w:numId w:val="2"/>
         </w:numPr>
         <w:rPr>
           <w:lang w:val="en-PK"/>
@@ -527,7 +252,118 @@
         <w:rPr>
           <w:lang w:val="en-PK"/>
         </w:rPr>
-        <w:t>POST /hr/login-session</w:t>
+        <w:t>GET https://attend-hub-v6i2.vercel.app/api/hr/holidays</w:t>
+      </w:r>
+    </w:p>
+    <w:p>
+      <w:pPr>
+        <w:numPr>
+          <w:ilvl w:val="0"/>
+          <w:numId w:val="2"/>
+        </w:numPr>
+        <w:rPr>
+          <w:lang w:val="en-PK"/>
+        </w:rPr>
+      </w:pPr>
+      <w:r>
+        <w:rPr>
+          <w:lang w:val="en-PK"/>
+        </w:rPr>
+        <w:t>GET https://attend-hub-v6i2.vercel.app/api/hr/announcements</w:t>
+      </w:r>
+    </w:p>
+    <w:p>
+      <w:pPr>
+        <w:numPr>
+          <w:ilvl w:val="0"/>
+          <w:numId w:val="2"/>
+        </w:numPr>
+        <w:rPr>
+          <w:lang w:val="en-PK"/>
+        </w:rPr>
+      </w:pPr>
+      <w:r>
+        <w:rPr>
+          <w:lang w:val="en-PK"/>
+        </w:rPr>
+        <w:t>POST https://attend-hub-v6i2.vercel.app/api/hr/wifi</w:t>
+      </w:r>
+    </w:p>
+    <w:p>
+      <w:pPr>
+        <w:numPr>
+          <w:ilvl w:val="0"/>
+          <w:numId w:val="2"/>
+        </w:numPr>
+        <w:rPr>
+          <w:lang w:val="en-PK"/>
+        </w:rPr>
+      </w:pPr>
+      <w:r>
+        <w:rPr>
+          <w:lang w:val="en-PK"/>
+        </w:rPr>
+        <w:t>POST https://attend-hub-v6i2.vercel.app/api/hr/device-info</w:t>
+      </w:r>
+    </w:p>
+    <w:p>
+      <w:pPr>
+        <w:numPr>
+          <w:ilvl w:val="0"/>
+          <w:numId w:val="2"/>
+        </w:numPr>
+        <w:rPr>
+          <w:lang w:val="en-PK"/>
+        </w:rPr>
+      </w:pPr>
+      <w:r>
+        <w:rPr>
+          <w:lang w:val="en-PK"/>
+        </w:rPr>
+        <w:t>POST https://attend-hub-v6i2.vercel.app/api/hr/login-session</w:t>
+      </w:r>
+    </w:p>
+    <w:p>
+      <w:pPr>
+        <w:numPr>
+          <w:ilvl w:val="0"/>
+          <w:numId w:val="2"/>
+        </w:numPr>
+        <w:rPr>
+          <w:lang w:val="en-PK"/>
+        </w:rPr>
+      </w:pPr>
+      <w:r>
+        <w:rPr>
+          <w:lang w:val="en-PK"/>
+        </w:rPr>
+        <w:t>GET https://attend-hub-v6i2.vercel.app/api/me</w:t>
+      </w:r>
+    </w:p>
+    <w:p>
+      <w:pPr>
+        <w:rPr>
+          <w:lang w:val="en-PK"/>
+        </w:rPr>
+      </w:pPr>
+      <w:r>
+        <w:rPr>
+          <w:lang w:val="en-PK"/>
+        </w:rPr>
+        <w:t>Login body: { "companyShortName": "...", "username": "...", "password": "..." }</w:t>
+      </w:r>
+    </w:p>
+    <w:p>
+      <w:pPr>
+        <w:rPr>
+          <w:lang w:val="en-PK"/>
+        </w:rPr>
+      </w:pPr>
+      <w:r>
+        <w:rPr>
+          <w:lang w:val="en-PK"/>
+        </w:rPr>
+        <w:t>Har API ke request/response fields developer ko Swagger se mil jayenge: https://attend-hub-v6i2.vercel.app/api/docs</w:t>
       </w:r>
     </w:p>
     <w:p/>
@@ -544,9 +380,9 @@
 <file path=word/numbering.xml><?xml version="1.0" encoding="utf-8"?>
 <w:numbering xmlns:wpc="http://schemas.microsoft.com/office/word/2010/wordprocessingCanvas" xmlns:cx="http://schemas.microsoft.com/office/drawing/2014/chartex" xmlns:cx1="http://schemas.microsoft.com/office/drawing/2015/9/8/chartex" xmlns:cx2="http://schemas.microsoft.com/office/drawing/2015/10/21/chartex" xmlns:cx3="http://schemas.microsoft.com/office/drawing/2016/5/9/chartex" xmlns:cx4="http://schemas.microsoft.com/office/drawing/2016/5/10/chartex" xmlns:cx5="http://schemas.microsoft.com/office/drawing/2016/5/11/chartex" xmlns:cx6="http://schemas.microsoft.com/office/drawing/2016/5/12/chartex" xmlns:cx7="http://schemas.microsoft.com/office/drawing/2016/5/13/chartex" xmlns:cx8="http://schemas.microsoft.com/office/drawing/2016/5/14/chartex" xmlns:mc="http://schemas.openxmlformats.org/markup-compatibility/2006" xmlns:aink="http://schemas.microsoft.com/office/drawing/2016/ink" xmlns:am3d="http://schemas.microsoft.com/office/drawing/2017/model3d" xmlns:o="urn:schemas-microsoft-com:office:office" xmlns:oel="http://schemas.microsoft.com/office/2019/extlst" xmlns:r="http://schemas.openxmlformats.org/officeDocument/2006/relationships" xmlns:m="http://schemas.openxmlformats.org/officeDocument/2006/math" xmlns:v="urn:schemas-microsoft-com:vml" xmlns:wp14="http://schemas.microsoft.com/office/word/2010/wordprocessingDrawing" xmlns:wp="http://schemas.openxmlformats.org/drawingml/2006/wordprocessingDrawing" xmlns:w10="urn:schemas-microsoft-com:office:word" xmlns:w="http://schemas.openxmlformats.org/wordprocessingml/2006/main" xmlns:w14="http://schemas.microsoft.com/office/word/2010/wordml" xmlns:w15="http://schemas.microsoft.com/office/word/2012/wordml" xmlns:w16cex="http://schemas.microsoft.com/office/word/2018/wordml/cex" xmlns:w16cid="http://schemas.microsoft.com/office/word/2016/wordml/cid" xmlns:w16="http://schemas.microsoft.com/office/word/2018/wordml" xmlns:w16du="http://schemas.microsoft.com/office/word/2023/wordml/word16du" xmlns:w16sdtdh="http://schemas.microsoft.com/office/word/2020/wordml/sdtdatahash" xmlns:w16sdtfl="http://schemas.microsoft.com/office/word/2024/wordml/sdtformatlock" xmlns:w16se="http://schemas.microsoft.com/office/word/2015/wordml/symex" xmlns:wpg="http://schemas.microsoft.com/office/word/2010/wordprocessingGroup" xmlns:wpi="http://schemas.microsoft.com/office/word/2010/wordprocessingInk" xmlns:wne="http://schemas.microsoft.com/office/word/2006/wordml" xmlns:wps="http://schemas.microsoft.com/office/word/2010/wordprocessingShape" mc:Ignorable="w14 w15 w16se w16cid w16 w16cex w16sdtdh w16sdtfl w16du wp14">
   <w:abstractNum w:abstractNumId="0" w15:restartNumberingAfterBreak="0">
-    <w:nsid w:val="291A0D11"/>
+    <w:nsid w:val="1AED23B0"/>
     <w:multiLevelType w:val="multilevel"/>
-    <w:tmpl w:val="D7EAC230"/>
+    <w:tmpl w:val="8952B40C"/>
     <w:lvl w:ilvl="0">
       <w:start w:val="1"/>
       <w:numFmt w:val="bullet"/>
@@ -693,9 +529,9 @@
     </w:lvl>
   </w:abstractNum>
   <w:abstractNum w:abstractNumId="1" w15:restartNumberingAfterBreak="0">
-    <w:nsid w:val="41E645C4"/>
+    <w:nsid w:val="70913751"/>
     <w:multiLevelType w:val="multilevel"/>
-    <w:tmpl w:val="58AE7EE6"/>
+    <w:tmpl w:val="CF50DB24"/>
     <w:lvl w:ilvl="0">
       <w:start w:val="1"/>
       <w:numFmt w:val="bullet"/>
@@ -841,315 +677,11 @@
       </w:rPr>
     </w:lvl>
   </w:abstractNum>
-  <w:abstractNum w:abstractNumId="2" w15:restartNumberingAfterBreak="0">
-    <w:nsid w:val="46432999"/>
-    <w:multiLevelType w:val="multilevel"/>
-    <w:tmpl w:val="38A2E686"/>
-    <w:lvl w:ilvl="0">
-      <w:start w:val="1"/>
-      <w:numFmt w:val="bullet"/>
-      <w:lvlText w:val=""/>
-      <w:lvlJc w:val="left"/>
-      <w:pPr>
-        <w:tabs>
-          <w:tab w:val="num" w:pos="720"/>
-        </w:tabs>
-        <w:ind w:left="720" w:hanging="360"/>
-      </w:pPr>
-      <w:rPr>
-        <w:rFonts w:ascii="Symbol" w:hAnsi="Symbol" w:hint="default"/>
-        <w:sz w:val="20"/>
-      </w:rPr>
-    </w:lvl>
-    <w:lvl w:ilvl="1" w:tentative="1">
-      <w:start w:val="1"/>
-      <w:numFmt w:val="bullet"/>
-      <w:lvlText w:val="o"/>
-      <w:lvlJc w:val="left"/>
-      <w:pPr>
-        <w:tabs>
-          <w:tab w:val="num" w:pos="1440"/>
-        </w:tabs>
-        <w:ind w:left="1440" w:hanging="360"/>
-      </w:pPr>
-      <w:rPr>
-        <w:rFonts w:ascii="Courier New" w:hAnsi="Courier New" w:hint="default"/>
-        <w:sz w:val="20"/>
-      </w:rPr>
-    </w:lvl>
-    <w:lvl w:ilvl="2" w:tentative="1">
-      <w:start w:val="1"/>
-      <w:numFmt w:val="bullet"/>
-      <w:lvlText w:val=""/>
-      <w:lvlJc w:val="left"/>
-      <w:pPr>
-        <w:tabs>
-          <w:tab w:val="num" w:pos="2160"/>
-        </w:tabs>
-        <w:ind w:left="2160" w:hanging="360"/>
-      </w:pPr>
-      <w:rPr>
-        <w:rFonts w:ascii="Wingdings" w:hAnsi="Wingdings" w:hint="default"/>
-        <w:sz w:val="20"/>
-      </w:rPr>
-    </w:lvl>
-    <w:lvl w:ilvl="3" w:tentative="1">
-      <w:start w:val="1"/>
-      <w:numFmt w:val="bullet"/>
-      <w:lvlText w:val=""/>
-      <w:lvlJc w:val="left"/>
-      <w:pPr>
-        <w:tabs>
-          <w:tab w:val="num" w:pos="2880"/>
-        </w:tabs>
-        <w:ind w:left="2880" w:hanging="360"/>
-      </w:pPr>
-      <w:rPr>
-        <w:rFonts w:ascii="Wingdings" w:hAnsi="Wingdings" w:hint="default"/>
-        <w:sz w:val="20"/>
-      </w:rPr>
-    </w:lvl>
-    <w:lvl w:ilvl="4" w:tentative="1">
-      <w:start w:val="1"/>
-      <w:numFmt w:val="bullet"/>
-      <w:lvlText w:val=""/>
-      <w:lvlJc w:val="left"/>
-      <w:pPr>
-        <w:tabs>
-          <w:tab w:val="num" w:pos="3600"/>
-        </w:tabs>
-        <w:ind w:left="3600" w:hanging="360"/>
-      </w:pPr>
-      <w:rPr>
-        <w:rFonts w:ascii="Wingdings" w:hAnsi="Wingdings" w:hint="default"/>
-        <w:sz w:val="20"/>
-      </w:rPr>
-    </w:lvl>
-    <w:lvl w:ilvl="5" w:tentative="1">
-      <w:start w:val="1"/>
-      <w:numFmt w:val="bullet"/>
-      <w:lvlText w:val=""/>
-      <w:lvlJc w:val="left"/>
-      <w:pPr>
-        <w:tabs>
-          <w:tab w:val="num" w:pos="4320"/>
-        </w:tabs>
-        <w:ind w:left="4320" w:hanging="360"/>
-      </w:pPr>
-      <w:rPr>
-        <w:rFonts w:ascii="Wingdings" w:hAnsi="Wingdings" w:hint="default"/>
-        <w:sz w:val="20"/>
-      </w:rPr>
-    </w:lvl>
-    <w:lvl w:ilvl="6" w:tentative="1">
-      <w:start w:val="1"/>
-      <w:numFmt w:val="bullet"/>
-      <w:lvlText w:val=""/>
-      <w:lvlJc w:val="left"/>
-      <w:pPr>
-        <w:tabs>
-          <w:tab w:val="num" w:pos="5040"/>
-        </w:tabs>
-        <w:ind w:left="5040" w:hanging="360"/>
-      </w:pPr>
-      <w:rPr>
-        <w:rFonts w:ascii="Wingdings" w:hAnsi="Wingdings" w:hint="default"/>
-        <w:sz w:val="20"/>
-      </w:rPr>
-    </w:lvl>
-    <w:lvl w:ilvl="7" w:tentative="1">
-      <w:start w:val="1"/>
-      <w:numFmt w:val="bullet"/>
-      <w:lvlText w:val=""/>
-      <w:lvlJc w:val="left"/>
-      <w:pPr>
-        <w:tabs>
-          <w:tab w:val="num" w:pos="5760"/>
-        </w:tabs>
-        <w:ind w:left="5760" w:hanging="360"/>
-      </w:pPr>
-      <w:rPr>
-        <w:rFonts w:ascii="Wingdings" w:hAnsi="Wingdings" w:hint="default"/>
-        <w:sz w:val="20"/>
-      </w:rPr>
-    </w:lvl>
-    <w:lvl w:ilvl="8" w:tentative="1">
-      <w:start w:val="1"/>
-      <w:numFmt w:val="bullet"/>
-      <w:lvlText w:val=""/>
-      <w:lvlJc w:val="left"/>
-      <w:pPr>
-        <w:tabs>
-          <w:tab w:val="num" w:pos="6480"/>
-        </w:tabs>
-        <w:ind w:left="6480" w:hanging="360"/>
-      </w:pPr>
-      <w:rPr>
-        <w:rFonts w:ascii="Wingdings" w:hAnsi="Wingdings" w:hint="default"/>
-        <w:sz w:val="20"/>
-      </w:rPr>
-    </w:lvl>
-  </w:abstractNum>
-  <w:abstractNum w:abstractNumId="3" w15:restartNumberingAfterBreak="0">
-    <w:nsid w:val="57AD43B8"/>
-    <w:multiLevelType w:val="multilevel"/>
-    <w:tmpl w:val="4E78C1A0"/>
-    <w:lvl w:ilvl="0">
-      <w:start w:val="1"/>
-      <w:numFmt w:val="bullet"/>
-      <w:lvlText w:val=""/>
-      <w:lvlJc w:val="left"/>
-      <w:pPr>
-        <w:tabs>
-          <w:tab w:val="num" w:pos="720"/>
-        </w:tabs>
-        <w:ind w:left="720" w:hanging="360"/>
-      </w:pPr>
-      <w:rPr>
-        <w:rFonts w:ascii="Symbol" w:hAnsi="Symbol" w:hint="default"/>
-        <w:sz w:val="20"/>
-      </w:rPr>
-    </w:lvl>
-    <w:lvl w:ilvl="1" w:tentative="1">
-      <w:start w:val="1"/>
-      <w:numFmt w:val="bullet"/>
-      <w:lvlText w:val="o"/>
-      <w:lvlJc w:val="left"/>
-      <w:pPr>
-        <w:tabs>
-          <w:tab w:val="num" w:pos="1440"/>
-        </w:tabs>
-        <w:ind w:left="1440" w:hanging="360"/>
-      </w:pPr>
-      <w:rPr>
-        <w:rFonts w:ascii="Courier New" w:hAnsi="Courier New" w:hint="default"/>
-        <w:sz w:val="20"/>
-      </w:rPr>
-    </w:lvl>
-    <w:lvl w:ilvl="2" w:tentative="1">
-      <w:start w:val="1"/>
-      <w:numFmt w:val="bullet"/>
-      <w:lvlText w:val=""/>
-      <w:lvlJc w:val="left"/>
-      <w:pPr>
-        <w:tabs>
-          <w:tab w:val="num" w:pos="2160"/>
-        </w:tabs>
-        <w:ind w:left="2160" w:hanging="360"/>
-      </w:pPr>
-      <w:rPr>
-        <w:rFonts w:ascii="Wingdings" w:hAnsi="Wingdings" w:hint="default"/>
-        <w:sz w:val="20"/>
-      </w:rPr>
-    </w:lvl>
-    <w:lvl w:ilvl="3" w:tentative="1">
-      <w:start w:val="1"/>
-      <w:numFmt w:val="bullet"/>
-      <w:lvlText w:val=""/>
-      <w:lvlJc w:val="left"/>
-      <w:pPr>
-        <w:tabs>
-          <w:tab w:val="num" w:pos="2880"/>
-        </w:tabs>
-        <w:ind w:left="2880" w:hanging="360"/>
-      </w:pPr>
-      <w:rPr>
-        <w:rFonts w:ascii="Wingdings" w:hAnsi="Wingdings" w:hint="default"/>
-        <w:sz w:val="20"/>
-      </w:rPr>
-    </w:lvl>
-    <w:lvl w:ilvl="4" w:tentative="1">
-      <w:start w:val="1"/>
-      <w:numFmt w:val="bullet"/>
-      <w:lvlText w:val=""/>
-      <w:lvlJc w:val="left"/>
-      <w:pPr>
-        <w:tabs>
-          <w:tab w:val="num" w:pos="3600"/>
-        </w:tabs>
-        <w:ind w:left="3600" w:hanging="360"/>
-      </w:pPr>
-      <w:rPr>
-        <w:rFonts w:ascii="Wingdings" w:hAnsi="Wingdings" w:hint="default"/>
-        <w:sz w:val="20"/>
-      </w:rPr>
-    </w:lvl>
-    <w:lvl w:ilvl="5" w:tentative="1">
-      <w:start w:val="1"/>
-      <w:numFmt w:val="bullet"/>
-      <w:lvlText w:val=""/>
-      <w:lvlJc w:val="left"/>
-      <w:pPr>
-        <w:tabs>
-          <w:tab w:val="num" w:pos="4320"/>
-        </w:tabs>
-        <w:ind w:left="4320" w:hanging="360"/>
-      </w:pPr>
-      <w:rPr>
-        <w:rFonts w:ascii="Wingdings" w:hAnsi="Wingdings" w:hint="default"/>
-        <w:sz w:val="20"/>
-      </w:rPr>
-    </w:lvl>
-    <w:lvl w:ilvl="6" w:tentative="1">
-      <w:start w:val="1"/>
-      <w:numFmt w:val="bullet"/>
-      <w:lvlText w:val=""/>
-      <w:lvlJc w:val="left"/>
-      <w:pPr>
-        <w:tabs>
-          <w:tab w:val="num" w:pos="5040"/>
-        </w:tabs>
-        <w:ind w:left="5040" w:hanging="360"/>
-      </w:pPr>
-      <w:rPr>
-        <w:rFonts w:ascii="Wingdings" w:hAnsi="Wingdings" w:hint="default"/>
-        <w:sz w:val="20"/>
-      </w:rPr>
-    </w:lvl>
-    <w:lvl w:ilvl="7" w:tentative="1">
-      <w:start w:val="1"/>
-      <w:numFmt w:val="bullet"/>
-      <w:lvlText w:val=""/>
-      <w:lvlJc w:val="left"/>
-      <w:pPr>
-        <w:tabs>
-          <w:tab w:val="num" w:pos="5760"/>
-        </w:tabs>
-        <w:ind w:left="5760" w:hanging="360"/>
-      </w:pPr>
-      <w:rPr>
-        <w:rFonts w:ascii="Wingdings" w:hAnsi="Wingdings" w:hint="default"/>
-        <w:sz w:val="20"/>
-      </w:rPr>
-    </w:lvl>
-    <w:lvl w:ilvl="8" w:tentative="1">
-      <w:start w:val="1"/>
-      <w:numFmt w:val="bullet"/>
-      <w:lvlText w:val=""/>
-      <w:lvlJc w:val="left"/>
-      <w:pPr>
-        <w:tabs>
-          <w:tab w:val="num" w:pos="6480"/>
-        </w:tabs>
-        <w:ind w:left="6480" w:hanging="360"/>
-      </w:pPr>
-      <w:rPr>
-        <w:rFonts w:ascii="Wingdings" w:hAnsi="Wingdings" w:hint="default"/>
-        <w:sz w:val="20"/>
-      </w:rPr>
-    </w:lvl>
-  </w:abstractNum>
-  <w:num w:numId="1" w16cid:durableId="653491933">
+  <w:num w:numId="1" w16cid:durableId="1329091742">
     <w:abstractNumId w:val="0"/>
   </w:num>
-  <w:num w:numId="2" w16cid:durableId="618611367">
-    <w:abstractNumId w:val="2"/>
-  </w:num>
-  <w:num w:numId="3" w16cid:durableId="1563560088">
+  <w:num w:numId="2" w16cid:durableId="1167743973">
     <w:abstractNumId w:val="1"/>
-  </w:num>
-  <w:num w:numId="4" w16cid:durableId="1426345933">
-    <w:abstractNumId w:val="3"/>
   </w:num>
 </w:numbering>
 </file>
@@ -1562,7 +1094,7 @@
     <w:link w:val="Heading1Char"/>
     <w:uiPriority w:val="9"/>
     <w:qFormat/>
-    <w:rsid w:val="003C670A"/>
+    <w:rsid w:val="005D0305"/>
     <w:pPr>
       <w:keepNext/>
       <w:keepLines/>
@@ -1585,7 +1117,7 @@
     <w:semiHidden/>
     <w:unhideWhenUsed/>
     <w:qFormat/>
-    <w:rsid w:val="003C670A"/>
+    <w:rsid w:val="005D0305"/>
     <w:pPr>
       <w:keepNext/>
       <w:keepLines/>
@@ -1608,7 +1140,7 @@
     <w:semiHidden/>
     <w:unhideWhenUsed/>
     <w:qFormat/>
-    <w:rsid w:val="003C670A"/>
+    <w:rsid w:val="005D0305"/>
     <w:pPr>
       <w:keepNext/>
       <w:keepLines/>
@@ -1631,7 +1163,7 @@
     <w:semiHidden/>
     <w:unhideWhenUsed/>
     <w:qFormat/>
-    <w:rsid w:val="003C670A"/>
+    <w:rsid w:val="005D0305"/>
     <w:pPr>
       <w:keepNext/>
       <w:keepLines/>
@@ -1654,7 +1186,7 @@
     <w:semiHidden/>
     <w:unhideWhenUsed/>
     <w:qFormat/>
-    <w:rsid w:val="003C670A"/>
+    <w:rsid w:val="005D0305"/>
     <w:pPr>
       <w:keepNext/>
       <w:keepLines/>
@@ -1675,7 +1207,7 @@
     <w:semiHidden/>
     <w:unhideWhenUsed/>
     <w:qFormat/>
-    <w:rsid w:val="003C670A"/>
+    <w:rsid w:val="005D0305"/>
     <w:pPr>
       <w:keepNext/>
       <w:keepLines/>
@@ -1698,7 +1230,7 @@
     <w:semiHidden/>
     <w:unhideWhenUsed/>
     <w:qFormat/>
-    <w:rsid w:val="003C670A"/>
+    <w:rsid w:val="005D0305"/>
     <w:pPr>
       <w:keepNext/>
       <w:keepLines/>
@@ -1719,7 +1251,7 @@
     <w:semiHidden/>
     <w:unhideWhenUsed/>
     <w:qFormat/>
-    <w:rsid w:val="003C670A"/>
+    <w:rsid w:val="005D0305"/>
     <w:pPr>
       <w:keepNext/>
       <w:keepLines/>
@@ -1742,7 +1274,7 @@
     <w:semiHidden/>
     <w:unhideWhenUsed/>
     <w:qFormat/>
-    <w:rsid w:val="003C670A"/>
+    <w:rsid w:val="005D0305"/>
     <w:pPr>
       <w:keepNext/>
       <w:keepLines/>
@@ -1785,7 +1317,7 @@
     <w:basedOn w:val="DefaultParagraphFont"/>
     <w:link w:val="Heading1"/>
     <w:uiPriority w:val="9"/>
-    <w:rsid w:val="003C670A"/>
+    <w:rsid w:val="005D0305"/>
     <w:rPr>
       <w:rFonts w:asciiTheme="majorHAnsi" w:eastAsiaTheme="majorEastAsia" w:hAnsiTheme="majorHAnsi" w:cstheme="majorBidi"/>
       <w:color w:val="2F5496" w:themeColor="accent1" w:themeShade="BF"/>
@@ -1799,7 +1331,7 @@
     <w:link w:val="Heading2"/>
     <w:uiPriority w:val="9"/>
     <w:semiHidden/>
-    <w:rsid w:val="003C670A"/>
+    <w:rsid w:val="005D0305"/>
     <w:rPr>
       <w:rFonts w:asciiTheme="majorHAnsi" w:eastAsiaTheme="majorEastAsia" w:hAnsiTheme="majorHAnsi" w:cstheme="majorBidi"/>
       <w:color w:val="2F5496" w:themeColor="accent1" w:themeShade="BF"/>
@@ -1813,7 +1345,7 @@
     <w:link w:val="Heading3"/>
     <w:uiPriority w:val="9"/>
     <w:semiHidden/>
-    <w:rsid w:val="003C670A"/>
+    <w:rsid w:val="005D0305"/>
     <w:rPr>
       <w:rFonts w:eastAsiaTheme="majorEastAsia" w:cstheme="majorBidi"/>
       <w:color w:val="2F5496" w:themeColor="accent1" w:themeShade="BF"/>
@@ -1827,7 +1359,7 @@
     <w:link w:val="Heading4"/>
     <w:uiPriority w:val="9"/>
     <w:semiHidden/>
-    <w:rsid w:val="003C670A"/>
+    <w:rsid w:val="005D0305"/>
     <w:rPr>
       <w:rFonts w:eastAsiaTheme="majorEastAsia" w:cstheme="majorBidi"/>
       <w:i/>
@@ -1841,7 +1373,7 @@
     <w:link w:val="Heading5"/>
     <w:uiPriority w:val="9"/>
     <w:semiHidden/>
-    <w:rsid w:val="003C670A"/>
+    <w:rsid w:val="005D0305"/>
     <w:rPr>
       <w:rFonts w:eastAsiaTheme="majorEastAsia" w:cstheme="majorBidi"/>
       <w:color w:val="2F5496" w:themeColor="accent1" w:themeShade="BF"/>
@@ -1853,7 +1385,7 @@
     <w:link w:val="Heading6"/>
     <w:uiPriority w:val="9"/>
     <w:semiHidden/>
-    <w:rsid w:val="003C670A"/>
+    <w:rsid w:val="005D0305"/>
     <w:rPr>
       <w:rFonts w:eastAsiaTheme="majorEastAsia" w:cstheme="majorBidi"/>
       <w:i/>
@@ -1867,7 +1399,7 @@
     <w:link w:val="Heading7"/>
     <w:uiPriority w:val="9"/>
     <w:semiHidden/>
-    <w:rsid w:val="003C670A"/>
+    <w:rsid w:val="005D0305"/>
     <w:rPr>
       <w:rFonts w:eastAsiaTheme="majorEastAsia" w:cstheme="majorBidi"/>
       <w:color w:val="595959" w:themeColor="text1" w:themeTint="A6"/>
@@ -1879,7 +1411,7 @@
     <w:link w:val="Heading8"/>
     <w:uiPriority w:val="9"/>
     <w:semiHidden/>
-    <w:rsid w:val="003C670A"/>
+    <w:rsid w:val="005D0305"/>
     <w:rPr>
       <w:rFonts w:eastAsiaTheme="majorEastAsia" w:cstheme="majorBidi"/>
       <w:i/>
@@ -1893,7 +1425,7 @@
     <w:link w:val="Heading9"/>
     <w:uiPriority w:val="9"/>
     <w:semiHidden/>
-    <w:rsid w:val="003C670A"/>
+    <w:rsid w:val="005D0305"/>
     <w:rPr>
       <w:rFonts w:eastAsiaTheme="majorEastAsia" w:cstheme="majorBidi"/>
       <w:color w:val="272727" w:themeColor="text1" w:themeTint="D8"/>
@@ -1906,7 +1438,7 @@
     <w:link w:val="TitleChar"/>
     <w:uiPriority w:val="10"/>
     <w:qFormat/>
-    <w:rsid w:val="003C670A"/>
+    <w:rsid w:val="005D0305"/>
     <w:pPr>
       <w:spacing w:after="80" w:line="240" w:lineRule="auto"/>
       <w:contextualSpacing/>
@@ -1924,7 +1456,7 @@
     <w:basedOn w:val="DefaultParagraphFont"/>
     <w:link w:val="Title"/>
     <w:uiPriority w:val="10"/>
-    <w:rsid w:val="003C670A"/>
+    <w:rsid w:val="005D0305"/>
     <w:rPr>
       <w:rFonts w:asciiTheme="majorHAnsi" w:eastAsiaTheme="majorEastAsia" w:hAnsiTheme="majorHAnsi" w:cstheme="majorBidi"/>
       <w:spacing w:val="-10"/>
@@ -1940,7 +1472,7 @@
     <w:link w:val="SubtitleChar"/>
     <w:uiPriority w:val="11"/>
     <w:qFormat/>
-    <w:rsid w:val="003C670A"/>
+    <w:rsid w:val="005D0305"/>
     <w:pPr>
       <w:numPr>
         <w:ilvl w:val="1"/>
@@ -1959,7 +1491,7 @@
     <w:basedOn w:val="DefaultParagraphFont"/>
     <w:link w:val="Subtitle"/>
     <w:uiPriority w:val="11"/>
-    <w:rsid w:val="003C670A"/>
+    <w:rsid w:val="005D0305"/>
     <w:rPr>
       <w:rFonts w:eastAsiaTheme="majorEastAsia" w:cstheme="majorBidi"/>
       <w:color w:val="595959" w:themeColor="text1" w:themeTint="A6"/>
@@ -1975,7 +1507,7 @@
     <w:link w:val="QuoteChar"/>
     <w:uiPriority w:val="29"/>
     <w:qFormat/>
-    <w:rsid w:val="003C670A"/>
+    <w:rsid w:val="005D0305"/>
     <w:pPr>
       <w:spacing w:before="160"/>
       <w:jc w:val="center"/>
@@ -1991,7 +1523,7 @@
     <w:basedOn w:val="DefaultParagraphFont"/>
     <w:link w:val="Quote"/>
     <w:uiPriority w:val="29"/>
-    <w:rsid w:val="003C670A"/>
+    <w:rsid w:val="005D0305"/>
     <w:rPr>
       <w:i/>
       <w:iCs/>
@@ -2003,7 +1535,7 @@
     <w:basedOn w:val="Normal"/>
     <w:uiPriority w:val="34"/>
     <w:qFormat/>
-    <w:rsid w:val="003C670A"/>
+    <w:rsid w:val="005D0305"/>
     <w:pPr>
       <w:ind w:left="720"/>
       <w:contextualSpacing/>
@@ -2014,7 +1546,7 @@
     <w:basedOn w:val="DefaultParagraphFont"/>
     <w:uiPriority w:val="21"/>
     <w:qFormat/>
-    <w:rsid w:val="003C670A"/>
+    <w:rsid w:val="005D0305"/>
     <w:rPr>
       <w:i/>
       <w:iCs/>
@@ -2028,7 +1560,7 @@
     <w:link w:val="IntenseQuoteChar"/>
     <w:uiPriority w:val="30"/>
     <w:qFormat/>
-    <w:rsid w:val="003C670A"/>
+    <w:rsid w:val="005D0305"/>
     <w:pPr>
       <w:pBdr>
         <w:top w:val="single" w:sz="4" w:space="10" w:color="2F5496" w:themeColor="accent1" w:themeShade="BF"/>
@@ -2049,7 +1581,7 @@
     <w:basedOn w:val="DefaultParagraphFont"/>
     <w:link w:val="IntenseQuote"/>
     <w:uiPriority w:val="30"/>
-    <w:rsid w:val="003C670A"/>
+    <w:rsid w:val="005D0305"/>
     <w:rPr>
       <w:i/>
       <w:iCs/>
@@ -2061,7 +1593,7 @@
     <w:basedOn w:val="DefaultParagraphFont"/>
     <w:uiPriority w:val="32"/>
     <w:qFormat/>
-    <w:rsid w:val="003C670A"/>
+    <w:rsid w:val="005D0305"/>
     <w:rPr>
       <w:b/>
       <w:bCs/>

</xml_diff>